<commit_message>
Adiciona carga horária às disciplinas e ajusta cor do selo EAD
- Novo campo opcional cargaHoraria em cada disciplina, presente nos dois
  extratores (pdf.mjs sempre null, docx.mjs lê a coluna quando existe).
- Modelo .docx ganha a coluna "Carga Horária" nas tabelas de disciplinas
  com data e EAD, gerada dinamicamente a partir de modelo-docx.mjs.
- Template do PDF mostra a carga horária como uma pílula discreta ao lado
  do nome da disciplina, com ícone de relógio; some quando vazia.
- Tela de revisão web ganha coluna editável de carga horária.
- Selo de modalidade "EAD" passa de cinza para vermelho sólido com texto
  branco, igual ao selo "Presencial".
- Testes: 3 novos casos em testar-docx.mjs para a coluna de carga horária
  (presente, ausente, fora de ordem). Suítes completas revalidadas:
  docx 13/13, template 21/21, servidor 10/10.

Co-Authored-By: Claude Sonnet 5 <noreply@anthropic.com>
</commit_message>
<xml_diff>
--- a/modelos/MODELO-CRONOGRAMA.docx
+++ b/modelos/MODELO-CRONOGRAMA.docx
@@ -630,7 +630,7 @@
           <w:sz w:val="18"/>
           <w:szCs w:val="18"/>
         </w:rPr>
-        <w:t xml:space="preserve">Uma disciplina por linha, na ordem em que devem aparecer no cronograma. A modalidade já vem preenchida como “Presencial” — troque só onde for diferente. Valores aceitos: Presencial, Ao Vivo, Online ou Híbrido. Se a data ainda não estiver fechada, escreva “A definir”.</w:t>
+        <w:t xml:space="preserve">Uma disciplina por linha, na ordem em que devem aparecer no cronograma. A modalidade já vem preenchida como “Presencial” — troque só onde for diferente. Valores aceitos: Presencial, Ao Vivo, Online ou Híbrido. Se a data ainda não estiver fechada, escreva “A definir”. Carga horária é opcional — no formato “40h”; deixe em branco quando não tiver essa informação.</w:t>
       </w:r>
     </w:p>
     <w:p>
@@ -663,6 +663,7 @@
         <w:gridCol w:w="100"/>
         <w:gridCol w:w="100"/>
         <w:gridCol w:w="100"/>
+        <w:gridCol w:w="100"/>
       </w:tblGrid>
       <w:tr>
         <w:trPr>
@@ -752,6 +753,27 @@
             </w:r>
           </w:p>
         </w:tc>
+        <w:tc>
+          <w:tcPr>
+            <w:shd w:fill="A62432"/>
+            <w:tcMar>
+              <w:top w:type="dxa" w:w="80"/>
+              <w:left w:type="dxa" w:w="120"/>
+              <w:bottom w:type="dxa" w:w="80"/>
+              <w:right w:type="dxa" w:w="120"/>
+            </w:tcMar>
+          </w:tcPr>
+          <w:p>
+            <w:r>
+              <w:rPr>
+                <w:b/>
+                <w:bCs/>
+                <w:color w:val="FFFFFF"/>
+              </w:rPr>
+              <w:t xml:space="preserve">Carga Horária</w:t>
+            </w:r>
+          </w:p>
+        </w:tc>
       </w:tr>
       <w:tr>
         <w:tc>
@@ -829,6 +851,24 @@
             </w:r>
           </w:p>
         </w:tc>
+        <w:tc>
+          <w:tcPr>
+            <w:tcMar>
+              <w:top w:type="dxa" w:w="80"/>
+              <w:left w:type="dxa" w:w="120"/>
+              <w:bottom w:type="dxa" w:w="80"/>
+              <w:right w:type="dxa" w:w="120"/>
+            </w:tcMar>
+          </w:tcPr>
+          <w:p>
+            <w:r>
+              <w:rPr>
+                <w:color w:val="5F5E5A"/>
+              </w:rPr>
+              <w:t xml:space="preserve">40h</w:t>
+            </w:r>
+          </w:p>
+        </w:tc>
       </w:tr>
       <w:tr>
         <w:tc>
@@ -906,6 +946,24 @@
             </w:r>
           </w:p>
         </w:tc>
+        <w:tc>
+          <w:tcPr>
+            <w:tcMar>
+              <w:top w:type="dxa" w:w="80"/>
+              <w:left w:type="dxa" w:w="120"/>
+              <w:bottom w:type="dxa" w:w="80"/>
+              <w:right w:type="dxa" w:w="120"/>
+            </w:tcMar>
+          </w:tcPr>
+          <w:p>
+            <w:r>
+              <w:rPr>
+                <w:color w:val="5F5E5A"/>
+              </w:rPr>
+              <w:t xml:space="preserve"/>
+            </w:r>
+          </w:p>
+        </w:tc>
       </w:tr>
       <w:tr>
         <w:tc>
@@ -983,6 +1041,24 @@
             </w:r>
           </w:p>
         </w:tc>
+        <w:tc>
+          <w:tcPr>
+            <w:tcMar>
+              <w:top w:type="dxa" w:w="80"/>
+              <w:left w:type="dxa" w:w="120"/>
+              <w:bottom w:type="dxa" w:w="80"/>
+              <w:right w:type="dxa" w:w="120"/>
+            </w:tcMar>
+          </w:tcPr>
+          <w:p>
+            <w:r>
+              <w:rPr>
+                <w:color w:val="5F5E5A"/>
+              </w:rPr>
+              <w:t xml:space="preserve"/>
+            </w:r>
+          </w:p>
+        </w:tc>
       </w:tr>
       <w:tr>
         <w:tc>
@@ -1060,6 +1136,24 @@
             </w:r>
           </w:p>
         </w:tc>
+        <w:tc>
+          <w:tcPr>
+            <w:tcMar>
+              <w:top w:type="dxa" w:w="80"/>
+              <w:left w:type="dxa" w:w="120"/>
+              <w:bottom w:type="dxa" w:w="80"/>
+              <w:right w:type="dxa" w:w="120"/>
+            </w:tcMar>
+          </w:tcPr>
+          <w:p>
+            <w:r>
+              <w:rPr>
+                <w:color w:val="5F5E5A"/>
+              </w:rPr>
+              <w:t xml:space="preserve"/>
+            </w:r>
+          </w:p>
+        </w:tc>
       </w:tr>
       <w:tr>
         <w:tc>
@@ -1137,6 +1231,24 @@
             </w:r>
           </w:p>
         </w:tc>
+        <w:tc>
+          <w:tcPr>
+            <w:tcMar>
+              <w:top w:type="dxa" w:w="80"/>
+              <w:left w:type="dxa" w:w="120"/>
+              <w:bottom w:type="dxa" w:w="80"/>
+              <w:right w:type="dxa" w:w="120"/>
+            </w:tcMar>
+          </w:tcPr>
+          <w:p>
+            <w:r>
+              <w:rPr>
+                <w:color w:val="5F5E5A"/>
+              </w:rPr>
+              <w:t xml:space="preserve"/>
+            </w:r>
+          </w:p>
+        </w:tc>
       </w:tr>
       <w:tr>
         <w:tc>
@@ -1214,6 +1326,24 @@
             </w:r>
           </w:p>
         </w:tc>
+        <w:tc>
+          <w:tcPr>
+            <w:tcMar>
+              <w:top w:type="dxa" w:w="80"/>
+              <w:left w:type="dxa" w:w="120"/>
+              <w:bottom w:type="dxa" w:w="80"/>
+              <w:right w:type="dxa" w:w="120"/>
+            </w:tcMar>
+          </w:tcPr>
+          <w:p>
+            <w:r>
+              <w:rPr>
+                <w:color w:val="5F5E5A"/>
+              </w:rPr>
+              <w:t xml:space="preserve"/>
+            </w:r>
+          </w:p>
+        </w:tc>
       </w:tr>
       <w:tr>
         <w:tc>
@@ -1291,6 +1421,24 @@
             </w:r>
           </w:p>
         </w:tc>
+        <w:tc>
+          <w:tcPr>
+            <w:tcMar>
+              <w:top w:type="dxa" w:w="80"/>
+              <w:left w:type="dxa" w:w="120"/>
+              <w:bottom w:type="dxa" w:w="80"/>
+              <w:right w:type="dxa" w:w="120"/>
+            </w:tcMar>
+          </w:tcPr>
+          <w:p>
+            <w:r>
+              <w:rPr>
+                <w:color w:val="5F5E5A"/>
+              </w:rPr>
+              <w:t xml:space="preserve"/>
+            </w:r>
+          </w:p>
+        </w:tc>
       </w:tr>
       <w:tr>
         <w:tc>
@@ -1368,6 +1516,24 @@
             </w:r>
           </w:p>
         </w:tc>
+        <w:tc>
+          <w:tcPr>
+            <w:tcMar>
+              <w:top w:type="dxa" w:w="80"/>
+              <w:left w:type="dxa" w:w="120"/>
+              <w:bottom w:type="dxa" w:w="80"/>
+              <w:right w:type="dxa" w:w="120"/>
+            </w:tcMar>
+          </w:tcPr>
+          <w:p>
+            <w:r>
+              <w:rPr>
+                <w:color w:val="5F5E5A"/>
+              </w:rPr>
+              <w:t xml:space="preserve"/>
+            </w:r>
+          </w:p>
+        </w:tc>
       </w:tr>
       <w:tr>
         <w:tc>
@@ -1445,6 +1611,24 @@
             </w:r>
           </w:p>
         </w:tc>
+        <w:tc>
+          <w:tcPr>
+            <w:tcMar>
+              <w:top w:type="dxa" w:w="80"/>
+              <w:left w:type="dxa" w:w="120"/>
+              <w:bottom w:type="dxa" w:w="80"/>
+              <w:right w:type="dxa" w:w="120"/>
+            </w:tcMar>
+          </w:tcPr>
+          <w:p>
+            <w:r>
+              <w:rPr>
+                <w:color w:val="5F5E5A"/>
+              </w:rPr>
+              <w:t xml:space="preserve"/>
+            </w:r>
+          </w:p>
+        </w:tc>
       </w:tr>
       <w:tr>
         <w:tc>
@@ -1522,6 +1706,24 @@
             </w:r>
           </w:p>
         </w:tc>
+        <w:tc>
+          <w:tcPr>
+            <w:tcMar>
+              <w:top w:type="dxa" w:w="80"/>
+              <w:left w:type="dxa" w:w="120"/>
+              <w:bottom w:type="dxa" w:w="80"/>
+              <w:right w:type="dxa" w:w="120"/>
+            </w:tcMar>
+          </w:tcPr>
+          <w:p>
+            <w:r>
+              <w:rPr>
+                <w:color w:val="5F5E5A"/>
+              </w:rPr>
+              <w:t xml:space="preserve"/>
+            </w:r>
+          </w:p>
+        </w:tc>
       </w:tr>
       <w:tr>
         <w:tc>
@@ -1599,6 +1801,24 @@
             </w:r>
           </w:p>
         </w:tc>
+        <w:tc>
+          <w:tcPr>
+            <w:tcMar>
+              <w:top w:type="dxa" w:w="80"/>
+              <w:left w:type="dxa" w:w="120"/>
+              <w:bottom w:type="dxa" w:w="80"/>
+              <w:right w:type="dxa" w:w="120"/>
+            </w:tcMar>
+          </w:tcPr>
+          <w:p>
+            <w:r>
+              <w:rPr>
+                <w:color w:val="5F5E5A"/>
+              </w:rPr>
+              <w:t xml:space="preserve"/>
+            </w:r>
+          </w:p>
+        </w:tc>
       </w:tr>
       <w:tr>
         <w:tc>
@@ -1676,6 +1896,24 @@
             </w:r>
           </w:p>
         </w:tc>
+        <w:tc>
+          <w:tcPr>
+            <w:tcMar>
+              <w:top w:type="dxa" w:w="80"/>
+              <w:left w:type="dxa" w:w="120"/>
+              <w:bottom w:type="dxa" w:w="80"/>
+              <w:right w:type="dxa" w:w="120"/>
+            </w:tcMar>
+          </w:tcPr>
+          <w:p>
+            <w:r>
+              <w:rPr>
+                <w:color w:val="5F5E5A"/>
+              </w:rPr>
+              <w:t xml:space="preserve"/>
+            </w:r>
+          </w:p>
+        </w:tc>
       </w:tr>
       <w:tr>
         <w:tc>
@@ -1753,6 +1991,24 @@
             </w:r>
           </w:p>
         </w:tc>
+        <w:tc>
+          <w:tcPr>
+            <w:tcMar>
+              <w:top w:type="dxa" w:w="80"/>
+              <w:left w:type="dxa" w:w="120"/>
+              <w:bottom w:type="dxa" w:w="80"/>
+              <w:right w:type="dxa" w:w="120"/>
+            </w:tcMar>
+          </w:tcPr>
+          <w:p>
+            <w:r>
+              <w:rPr>
+                <w:color w:val="5F5E5A"/>
+              </w:rPr>
+              <w:t xml:space="preserve"/>
+            </w:r>
+          </w:p>
+        </w:tc>
       </w:tr>
       <w:tr>
         <w:tc>
@@ -1830,6 +2086,24 @@
             </w:r>
           </w:p>
         </w:tc>
+        <w:tc>
+          <w:tcPr>
+            <w:tcMar>
+              <w:top w:type="dxa" w:w="80"/>
+              <w:left w:type="dxa" w:w="120"/>
+              <w:bottom w:type="dxa" w:w="80"/>
+              <w:right w:type="dxa" w:w="120"/>
+            </w:tcMar>
+          </w:tcPr>
+          <w:p>
+            <w:r>
+              <w:rPr>
+                <w:color w:val="5F5E5A"/>
+              </w:rPr>
+              <w:t xml:space="preserve"/>
+            </w:r>
+          </w:p>
+        </w:tc>
       </w:tr>
       <w:tr>
         <w:tc>
@@ -1907,6 +2181,24 @@
             </w:r>
           </w:p>
         </w:tc>
+        <w:tc>
+          <w:tcPr>
+            <w:tcMar>
+              <w:top w:type="dxa" w:w="80"/>
+              <w:left w:type="dxa" w:w="120"/>
+              <w:bottom w:type="dxa" w:w="80"/>
+              <w:right w:type="dxa" w:w="120"/>
+            </w:tcMar>
+          </w:tcPr>
+          <w:p>
+            <w:r>
+              <w:rPr>
+                <w:color w:val="5F5E5A"/>
+              </w:rPr>
+              <w:t xml:space="preserve"/>
+            </w:r>
+          </w:p>
+        </w:tc>
       </w:tr>
       <w:tr>
         <w:tc>
@@ -1984,6 +2276,24 @@
             </w:r>
           </w:p>
         </w:tc>
+        <w:tc>
+          <w:tcPr>
+            <w:tcMar>
+              <w:top w:type="dxa" w:w="80"/>
+              <w:left w:type="dxa" w:w="120"/>
+              <w:bottom w:type="dxa" w:w="80"/>
+              <w:right w:type="dxa" w:w="120"/>
+            </w:tcMar>
+          </w:tcPr>
+          <w:p>
+            <w:r>
+              <w:rPr>
+                <w:color w:val="5F5E5A"/>
+              </w:rPr>
+              <w:t xml:space="preserve"/>
+            </w:r>
+          </w:p>
+        </w:tc>
       </w:tr>
       <w:tr>
         <w:tc>
@@ -2061,6 +2371,24 @@
             </w:r>
           </w:p>
         </w:tc>
+        <w:tc>
+          <w:tcPr>
+            <w:tcMar>
+              <w:top w:type="dxa" w:w="80"/>
+              <w:left w:type="dxa" w:w="120"/>
+              <w:bottom w:type="dxa" w:w="80"/>
+              <w:right w:type="dxa" w:w="120"/>
+            </w:tcMar>
+          </w:tcPr>
+          <w:p>
+            <w:r>
+              <w:rPr>
+                <w:color w:val="5F5E5A"/>
+              </w:rPr>
+              <w:t xml:space="preserve"/>
+            </w:r>
+          </w:p>
+        </w:tc>
       </w:tr>
       <w:tr>
         <w:tc>
@@ -2138,6 +2466,24 @@
             </w:r>
           </w:p>
         </w:tc>
+        <w:tc>
+          <w:tcPr>
+            <w:tcMar>
+              <w:top w:type="dxa" w:w="80"/>
+              <w:left w:type="dxa" w:w="120"/>
+              <w:bottom w:type="dxa" w:w="80"/>
+              <w:right w:type="dxa" w:w="120"/>
+            </w:tcMar>
+          </w:tcPr>
+          <w:p>
+            <w:r>
+              <w:rPr>
+                <w:color w:val="5F5E5A"/>
+              </w:rPr>
+              <w:t xml:space="preserve"/>
+            </w:r>
+          </w:p>
+        </w:tc>
       </w:tr>
       <w:tr>
         <w:tc>
@@ -2215,6 +2561,24 @@
             </w:r>
           </w:p>
         </w:tc>
+        <w:tc>
+          <w:tcPr>
+            <w:tcMar>
+              <w:top w:type="dxa" w:w="80"/>
+              <w:left w:type="dxa" w:w="120"/>
+              <w:bottom w:type="dxa" w:w="80"/>
+              <w:right w:type="dxa" w:w="120"/>
+            </w:tcMar>
+          </w:tcPr>
+          <w:p>
+            <w:r>
+              <w:rPr>
+                <w:color w:val="5F5E5A"/>
+              </w:rPr>
+              <w:t xml:space="preserve"/>
+            </w:r>
+          </w:p>
+        </w:tc>
       </w:tr>
       <w:tr>
         <w:tc>
@@ -2292,6 +2656,24 @@
             </w:r>
           </w:p>
         </w:tc>
+        <w:tc>
+          <w:tcPr>
+            <w:tcMar>
+              <w:top w:type="dxa" w:w="80"/>
+              <w:left w:type="dxa" w:w="120"/>
+              <w:bottom w:type="dxa" w:w="80"/>
+              <w:right w:type="dxa" w:w="120"/>
+            </w:tcMar>
+          </w:tcPr>
+          <w:p>
+            <w:r>
+              <w:rPr>
+                <w:color w:val="5F5E5A"/>
+              </w:rPr>
+              <w:t xml:space="preserve"/>
+            </w:r>
+          </w:p>
+        </w:tc>
       </w:tr>
       <w:tr>
         <w:tc>
@@ -2369,6 +2751,24 @@
             </w:r>
           </w:p>
         </w:tc>
+        <w:tc>
+          <w:tcPr>
+            <w:tcMar>
+              <w:top w:type="dxa" w:w="80"/>
+              <w:left w:type="dxa" w:w="120"/>
+              <w:bottom w:type="dxa" w:w="80"/>
+              <w:right w:type="dxa" w:w="120"/>
+            </w:tcMar>
+          </w:tcPr>
+          <w:p>
+            <w:r>
+              <w:rPr>
+                <w:color w:val="5F5E5A"/>
+              </w:rPr>
+              <w:t xml:space="preserve"/>
+            </w:r>
+          </w:p>
+        </w:tc>
       </w:tr>
       <w:tr>
         <w:tc>
@@ -2407,6 +2807,24 @@
                 <w:color w:val="5F5E5A"/>
               </w:rPr>
               <w:t xml:space="preserve">Presencial</w:t>
+            </w:r>
+          </w:p>
+        </w:tc>
+        <w:tc>
+          <w:tcPr>
+            <w:tcMar>
+              <w:top w:type="dxa" w:w="80"/>
+              <w:left w:type="dxa" w:w="120"/>
+              <w:bottom w:type="dxa" w:w="80"/>
+              <w:right w:type="dxa" w:w="120"/>
+            </w:tcMar>
+          </w:tcPr>
+          <w:p>
+            <w:r>
+              <w:rPr>
+                <w:color w:val="5F5E5A"/>
+              </w:rPr>
+              <w:t xml:space="preserve"/>
             </w:r>
           </w:p>
         </w:tc>
@@ -2468,7 +2886,7 @@
           <w:sz w:val="18"/>
           <w:szCs w:val="18"/>
         </w:rPr>
-        <w:t xml:space="preserve">Só o nome. Estas disciplinas ficam liberadas na plataforma durante todo o curso, por isso não têm data e saem num bloco separado no cronograma.</w:t>
+        <w:t xml:space="preserve">O nome e, se quiser, a carga horária. Estas disciplinas ficam liberadas na plataforma durante todo o curso, por isso não têm data e saem num bloco separado no cronograma.</w:t>
       </w:r>
     </w:p>
     <w:p/>
@@ -2487,6 +2905,7 @@
       <w:tblGrid>
         <w:gridCol w:w="100"/>
         <w:gridCol w:w="100"/>
+        <w:gridCol w:w="100"/>
       </w:tblGrid>
       <w:tr>
         <w:trPr>
@@ -2534,6 +2953,27 @@
             </w:r>
           </w:p>
         </w:tc>
+        <w:tc>
+          <w:tcPr>
+            <w:shd w:fill="A62432"/>
+            <w:tcMar>
+              <w:top w:type="dxa" w:w="80"/>
+              <w:left w:type="dxa" w:w="120"/>
+              <w:bottom w:type="dxa" w:w="80"/>
+              <w:right w:type="dxa" w:w="120"/>
+            </w:tcMar>
+          </w:tcPr>
+          <w:p>
+            <w:r>
+              <w:rPr>
+                <w:b/>
+                <w:bCs/>
+                <w:color w:val="FFFFFF"/>
+              </w:rPr>
+              <w:t xml:space="preserve">Carga Horária</w:t>
+            </w:r>
+          </w:p>
+        </w:tc>
       </w:tr>
       <w:tr>
         <w:tc>
@@ -2575,6 +3015,24 @@
             </w:r>
           </w:p>
         </w:tc>
+        <w:tc>
+          <w:tcPr>
+            <w:tcMar>
+              <w:top w:type="dxa" w:w="80"/>
+              <w:left w:type="dxa" w:w="120"/>
+              <w:bottom w:type="dxa" w:w="80"/>
+              <w:right w:type="dxa" w:w="120"/>
+            </w:tcMar>
+          </w:tcPr>
+          <w:p>
+            <w:r>
+              <w:rPr>
+                <w:color w:val="5F5E5A"/>
+              </w:rPr>
+              <w:t xml:space="preserve">20h</w:t>
+            </w:r>
+          </w:p>
+        </w:tc>
       </w:tr>
       <w:tr>
         <w:tc>
@@ -2616,6 +3074,24 @@
             </w:r>
           </w:p>
         </w:tc>
+        <w:tc>
+          <w:tcPr>
+            <w:tcMar>
+              <w:top w:type="dxa" w:w="80"/>
+              <w:left w:type="dxa" w:w="120"/>
+              <w:bottom w:type="dxa" w:w="80"/>
+              <w:right w:type="dxa" w:w="120"/>
+            </w:tcMar>
+          </w:tcPr>
+          <w:p>
+            <w:r>
+              <w:rPr>
+                <w:color w:val="5F5E5A"/>
+              </w:rPr>
+              <w:t xml:space="preserve"/>
+            </w:r>
+          </w:p>
+        </w:tc>
       </w:tr>
       <w:tr>
         <w:tc>
@@ -2657,6 +3133,24 @@
             </w:r>
           </w:p>
         </w:tc>
+        <w:tc>
+          <w:tcPr>
+            <w:tcMar>
+              <w:top w:type="dxa" w:w="80"/>
+              <w:left w:type="dxa" w:w="120"/>
+              <w:bottom w:type="dxa" w:w="80"/>
+              <w:right w:type="dxa" w:w="120"/>
+            </w:tcMar>
+          </w:tcPr>
+          <w:p>
+            <w:r>
+              <w:rPr>
+                <w:color w:val="5F5E5A"/>
+              </w:rPr>
+              <w:t xml:space="preserve"/>
+            </w:r>
+          </w:p>
+        </w:tc>
       </w:tr>
       <w:tr>
         <w:tc>
@@ -2698,6 +3192,24 @@
             </w:r>
           </w:p>
         </w:tc>
+        <w:tc>
+          <w:tcPr>
+            <w:tcMar>
+              <w:top w:type="dxa" w:w="80"/>
+              <w:left w:type="dxa" w:w="120"/>
+              <w:bottom w:type="dxa" w:w="80"/>
+              <w:right w:type="dxa" w:w="120"/>
+            </w:tcMar>
+          </w:tcPr>
+          <w:p>
+            <w:r>
+              <w:rPr>
+                <w:color w:val="5F5E5A"/>
+              </w:rPr>
+              <w:t xml:space="preserve"/>
+            </w:r>
+          </w:p>
+        </w:tc>
       </w:tr>
       <w:tr>
         <w:tc>
@@ -2739,6 +3251,24 @@
             </w:r>
           </w:p>
         </w:tc>
+        <w:tc>
+          <w:tcPr>
+            <w:tcMar>
+              <w:top w:type="dxa" w:w="80"/>
+              <w:left w:type="dxa" w:w="120"/>
+              <w:bottom w:type="dxa" w:w="80"/>
+              <w:right w:type="dxa" w:w="120"/>
+            </w:tcMar>
+          </w:tcPr>
+          <w:p>
+            <w:r>
+              <w:rPr>
+                <w:color w:val="5F5E5A"/>
+              </w:rPr>
+              <w:t xml:space="preserve"/>
+            </w:r>
+          </w:p>
+        </w:tc>
       </w:tr>
       <w:tr>
         <w:tc>
@@ -2780,6 +3310,24 @@
             </w:r>
           </w:p>
         </w:tc>
+        <w:tc>
+          <w:tcPr>
+            <w:tcMar>
+              <w:top w:type="dxa" w:w="80"/>
+              <w:left w:type="dxa" w:w="120"/>
+              <w:bottom w:type="dxa" w:w="80"/>
+              <w:right w:type="dxa" w:w="120"/>
+            </w:tcMar>
+          </w:tcPr>
+          <w:p>
+            <w:r>
+              <w:rPr>
+                <w:color w:val="5F5E5A"/>
+              </w:rPr>
+              <w:t xml:space="preserve"/>
+            </w:r>
+          </w:p>
+        </w:tc>
       </w:tr>
       <w:tr>
         <w:tc>
@@ -2821,6 +3369,24 @@
             </w:r>
           </w:p>
         </w:tc>
+        <w:tc>
+          <w:tcPr>
+            <w:tcMar>
+              <w:top w:type="dxa" w:w="80"/>
+              <w:left w:type="dxa" w:w="120"/>
+              <w:bottom w:type="dxa" w:w="80"/>
+              <w:right w:type="dxa" w:w="120"/>
+            </w:tcMar>
+          </w:tcPr>
+          <w:p>
+            <w:r>
+              <w:rPr>
+                <w:color w:val="5F5E5A"/>
+              </w:rPr>
+              <w:t xml:space="preserve"/>
+            </w:r>
+          </w:p>
+        </w:tc>
       </w:tr>
       <w:tr>
         <w:tc>
@@ -2862,6 +3428,24 @@
             </w:r>
           </w:p>
         </w:tc>
+        <w:tc>
+          <w:tcPr>
+            <w:tcMar>
+              <w:top w:type="dxa" w:w="80"/>
+              <w:left w:type="dxa" w:w="120"/>
+              <w:bottom w:type="dxa" w:w="80"/>
+              <w:right w:type="dxa" w:w="120"/>
+            </w:tcMar>
+          </w:tcPr>
+          <w:p>
+            <w:r>
+              <w:rPr>
+                <w:color w:val="5F5E5A"/>
+              </w:rPr>
+              <w:t xml:space="preserve"/>
+            </w:r>
+          </w:p>
+        </w:tc>
       </w:tr>
       <w:tr>
         <w:tc>
@@ -2903,6 +3487,24 @@
             </w:r>
           </w:p>
         </w:tc>
+        <w:tc>
+          <w:tcPr>
+            <w:tcMar>
+              <w:top w:type="dxa" w:w="80"/>
+              <w:left w:type="dxa" w:w="120"/>
+              <w:bottom w:type="dxa" w:w="80"/>
+              <w:right w:type="dxa" w:w="120"/>
+            </w:tcMar>
+          </w:tcPr>
+          <w:p>
+            <w:r>
+              <w:rPr>
+                <w:color w:val="5F5E5A"/>
+              </w:rPr>
+              <w:t xml:space="preserve"/>
+            </w:r>
+          </w:p>
+        </w:tc>
       </w:tr>
       <w:tr>
         <w:tc>
@@ -2944,6 +3546,24 @@
             </w:r>
           </w:p>
         </w:tc>
+        <w:tc>
+          <w:tcPr>
+            <w:tcMar>
+              <w:top w:type="dxa" w:w="80"/>
+              <w:left w:type="dxa" w:w="120"/>
+              <w:bottom w:type="dxa" w:w="80"/>
+              <w:right w:type="dxa" w:w="120"/>
+            </w:tcMar>
+          </w:tcPr>
+          <w:p>
+            <w:r>
+              <w:rPr>
+                <w:color w:val="5F5E5A"/>
+              </w:rPr>
+              <w:t xml:space="preserve"/>
+            </w:r>
+          </w:p>
+        </w:tc>
       </w:tr>
       <w:tr>
         <w:tc>
@@ -2964,6 +3584,24 @@
                 <w:szCs w:val="16"/>
               </w:rPr>
               <w:t xml:space="preserve">11</w:t>
+            </w:r>
+          </w:p>
+        </w:tc>
+        <w:tc>
+          <w:tcPr>
+            <w:tcMar>
+              <w:top w:type="dxa" w:w="80"/>
+              <w:left w:type="dxa" w:w="120"/>
+              <w:bottom w:type="dxa" w:w="80"/>
+              <w:right w:type="dxa" w:w="120"/>
+            </w:tcMar>
+          </w:tcPr>
+          <w:p>
+            <w:r>
+              <w:rPr>
+                <w:color w:val="5F5E5A"/>
+              </w:rPr>
+              <w:t xml:space="preserve"/>
             </w:r>
           </w:p>
         </w:tc>

</xml_diff>